<commit_message>
Cover letter form: remove contact details, dates and signatures
[skip ci]

Co-Authored-By: Claude Opus 5.5 <noreply@anthropic.com>
Claude-Session: https://claude.ai/code/session_01MH8hV4VCDGMnyCsHYy4z5c
</commit_message>
<xml_diff>
--- a/research/sec_detection_2026-10-26/SEC_cover_letter_form_DRAFT.docx
+++ b/research/sec_detection_2026-10-26/SEC_cover_letter_form_DRAFT.docx
@@ -563,55 +563,6 @@
     </w:p>
     <w:p>
       <w:pPr>
-        <w:pStyle w:val="a3"/>
-        <w:rPr>
-          <w:rFonts w:ascii="Times New Roman" w:eastAsiaTheme="minorEastAsia" w:hAnsi="Times New Roman" w:cs="Times New Roman"/>
-          <w:sz w:val="20"/>
-          <w:szCs w:val="20"/>
-          <w:lang w:val="en-US" w:eastAsia="ko-KR"/>
-        </w:rPr>
-      </w:pPr>
-      <w:r>
-        <w:rPr>
-          <w:rFonts w:ascii="Times New Roman" w:eastAsiaTheme="minorEastAsia" w:hAnsi="Times New Roman" w:cs="Times New Roman"/>
-          <w:sz w:val="20"/>
-          <w:szCs w:val="20"/>
-          <w:lang w:val="en-US" w:eastAsia="ko-KR"/>
-        </w:rPr>
-        <w:t>Address:</w:t>
-      </w:r>
-      <w:r>
-        <w:rPr>
-          <w:highlight w:val="yellow"/>
-        </w:rPr>
-        <w:t xml:space="preserve"> [ADD BEFORE SENDING]</w:t>
-      </w:r>
-    </w:p>
-    <w:p>
-      <w:pPr>
-        <w:pStyle w:val="a3"/>
-        <w:rPr>
-          <w:rFonts w:ascii="Times New Roman" w:eastAsiaTheme="minorEastAsia" w:hAnsi="Times New Roman" w:cs="Times New Roman"/>
-          <w:sz w:val="20"/>
-          <w:szCs w:val="20"/>
-          <w:lang w:val="en-US" w:eastAsia="ko-KR"/>
-        </w:rPr>
-      </w:pPr>
-      <w:r>
-        <w:rPr>
-          <w:rFonts w:ascii="Times New Roman" w:eastAsiaTheme="minorEastAsia" w:hAnsi="Times New Roman" w:cs="Times New Roman"/>
-          <w:sz w:val="20"/>
-          <w:szCs w:val="20"/>
-          <w:lang w:val="en-US" w:eastAsia="ko-KR"/>
-        </w:rPr>
-        <w:t>Personal university web page:</w:t>
-      </w:r>
-      <w:r>
-        <w:t xml:space="preserve"> Not applicable</w:t>
-      </w:r>
-    </w:p>
-    <w:p>
-      <w:pPr>
         <w:pStyle w:val="Default"/>
         <w:jc w:val="both"/>
         <w:rPr>
@@ -626,118 +577,10 @@
           <w:sz w:val="20"/>
           <w:szCs w:val="20"/>
         </w:rPr>
-        <w:t>Email:</w:t>
-      </w:r>
-      <w:r>
-        <w:t xml:space="preserve"> info@jrsstandard.com</w:t>
-      </w:r>
-    </w:p>
-    <w:p>
-      <w:pPr>
-        <w:pStyle w:val="Default"/>
-        <w:tabs>
-          <w:tab w:val="left" w:pos="6210"/>
-        </w:tabs>
-        <w:jc w:val="both"/>
-        <w:rPr>
-          <w:color w:val="auto"/>
-          <w:sz w:val="20"/>
-          <w:szCs w:val="20"/>
-        </w:rPr>
-      </w:pPr>
-      <w:r>
-        <w:rPr>
-          <w:color w:val="auto"/>
-          <w:sz w:val="20"/>
-          <w:szCs w:val="20"/>
-        </w:rPr>
-        <w:t>Phone:</w:t>
-      </w:r>
-      <w:r>
-        <w:rPr>
-          <w:color w:val="auto"/>
-          <w:sz w:val="20"/>
-          <w:szCs w:val="20"/>
-        </w:rPr>
-        <w:tab/>
-      </w:r>
-      <w:r>
-        <w:rPr>
-          <w:highlight w:val="yellow"/>
-        </w:rPr>
-        <w:t xml:space="preserve"> [ADD BEFORE SENDING]</w:t>
-      </w:r>
-    </w:p>
-    <w:p>
-      <w:pPr>
-        <w:pStyle w:val="Default"/>
-        <w:jc w:val="both"/>
-        <w:rPr>
-          <w:color w:val="auto"/>
-          <w:sz w:val="20"/>
-          <w:szCs w:val="20"/>
-        </w:rPr>
-      </w:pPr>
-      <w:r>
-        <w:rPr>
-          <w:color w:val="auto"/>
-          <w:sz w:val="20"/>
-          <w:szCs w:val="20"/>
-        </w:rPr>
         <w:t>ORCID:</w:t>
       </w:r>
       <w:r>
         <w:t xml:space="preserve"> 0009-0009-7230-3661</w:t>
-      </w:r>
-    </w:p>
-    <w:p>
-      <w:pPr>
-        <w:pStyle w:val="Default"/>
-        <w:jc w:val="both"/>
-        <w:rPr>
-          <w:color w:val="auto"/>
-          <w:sz w:val="20"/>
-          <w:szCs w:val="20"/>
-        </w:rPr>
-      </w:pPr>
-      <w:r>
-        <w:rPr>
-          <w:color w:val="auto"/>
-          <w:sz w:val="20"/>
-          <w:szCs w:val="20"/>
-        </w:rPr>
-        <w:t>Web of Science Researcher ID:</w:t>
-      </w:r>
-      <w:r>
-        <w:rPr>
-          <w:highlight w:val="yellow"/>
-        </w:rPr>
-        <w:t xml:space="preserve"> [ADD IF AVAILABLE]</w:t>
-      </w:r>
-    </w:p>
-    <w:p>
-      <w:pPr>
-        <w:pStyle w:val="Default"/>
-        <w:jc w:val="both"/>
-        <w:rPr>
-          <w:color w:val="auto"/>
-          <w:sz w:val="20"/>
-          <w:szCs w:val="20"/>
-        </w:rPr>
-      </w:pPr>
-      <w:r>
-        <w:rPr>
-          <w:color w:val="auto"/>
-          <w:sz w:val="20"/>
-          <w:szCs w:val="20"/>
-        </w:rPr>
-        <w:t>Submission date:</w:t>
-      </w:r>
-      <w:r>
-        <w:rPr>
-          <w:highlight w:val="yellow"/>
-        </w:rPr>
-        <w:t xml:space="preserve"> [DATE]</w:t>
       </w:r>
     </w:p>
     <w:p>
@@ -1630,55 +1473,6 @@
     </w:p>
     <w:p>
       <w:pPr>
-        <w:pStyle w:val="a3"/>
-        <w:rPr>
-          <w:rFonts w:ascii="Times New Roman" w:eastAsiaTheme="minorEastAsia" w:hAnsi="Times New Roman" w:cs="Times New Roman"/>
-          <w:sz w:val="20"/>
-          <w:szCs w:val="20"/>
-          <w:lang w:val="en-US" w:eastAsia="ko-KR"/>
-        </w:rPr>
-      </w:pPr>
-      <w:r>
-        <w:rPr>
-          <w:rFonts w:ascii="Times New Roman" w:eastAsiaTheme="minorEastAsia" w:hAnsi="Times New Roman" w:cs="Times New Roman"/>
-          <w:sz w:val="20"/>
-          <w:szCs w:val="20"/>
-          <w:lang w:val="en-US" w:eastAsia="ko-KR"/>
-        </w:rPr>
-        <w:t>Address:</w:t>
-      </w:r>
-      <w:r>
-        <w:rPr>
-          <w:highlight w:val="yellow"/>
-        </w:rPr>
-        <w:t xml:space="preserve"> [ADD BEFORE SENDING]</w:t>
-      </w:r>
-    </w:p>
-    <w:p>
-      <w:pPr>
-        <w:pStyle w:val="a3"/>
-        <w:rPr>
-          <w:rFonts w:ascii="Times New Roman" w:eastAsiaTheme="minorEastAsia" w:hAnsi="Times New Roman" w:cs="Times New Roman"/>
-          <w:sz w:val="20"/>
-          <w:szCs w:val="20"/>
-          <w:lang w:val="en-US" w:eastAsia="ko-KR"/>
-        </w:rPr>
-      </w:pPr>
-      <w:r>
-        <w:rPr>
-          <w:rFonts w:ascii="Times New Roman" w:eastAsiaTheme="minorEastAsia" w:hAnsi="Times New Roman" w:cs="Times New Roman"/>
-          <w:sz w:val="20"/>
-          <w:szCs w:val="20"/>
-          <w:lang w:val="en-US" w:eastAsia="ko-KR"/>
-        </w:rPr>
-        <w:t>Personal university web page:</w:t>
-      </w:r>
-      <w:r>
-        <w:t xml:space="preserve"> Not applicable</w:t>
-      </w:r>
-    </w:p>
-    <w:p>
-      <w:pPr>
         <w:pStyle w:val="Default"/>
         <w:jc w:val="both"/>
         <w:rPr>
@@ -1693,110 +1487,10 @@
           <w:sz w:val="20"/>
           <w:szCs w:val="20"/>
         </w:rPr>
-        <w:t>Email:</w:t>
-      </w:r>
-      <w:r>
-        <w:rPr>
-          <w:highlight w:val="yellow"/>
-        </w:rPr>
-        <w:t xml:space="preserve"> [ADD: his own email address]</w:t>
-      </w:r>
-    </w:p>
-    <w:p>
-      <w:pPr>
-        <w:pStyle w:val="Default"/>
-        <w:jc w:val="both"/>
-        <w:rPr>
-          <w:color w:val="auto"/>
-          <w:sz w:val="20"/>
-          <w:szCs w:val="20"/>
-        </w:rPr>
-      </w:pPr>
-      <w:r>
-        <w:rPr>
-          <w:color w:val="auto"/>
-          <w:sz w:val="20"/>
-          <w:szCs w:val="20"/>
-        </w:rPr>
-        <w:t>Phone:</w:t>
-      </w:r>
-      <w:r>
-        <w:rPr>
-          <w:highlight w:val="yellow"/>
-        </w:rPr>
-        <w:t xml:space="preserve"> [ADD BEFORE SENDING]</w:t>
-      </w:r>
-    </w:p>
-    <w:p>
-      <w:pPr>
-        <w:pStyle w:val="Default"/>
-        <w:jc w:val="both"/>
-        <w:rPr>
-          <w:color w:val="auto"/>
-          <w:sz w:val="20"/>
-          <w:szCs w:val="20"/>
-        </w:rPr>
-      </w:pPr>
-      <w:r>
-        <w:rPr>
-          <w:color w:val="auto"/>
-          <w:sz w:val="20"/>
-          <w:szCs w:val="20"/>
-        </w:rPr>
         <w:t>ORCID:</w:t>
       </w:r>
       <w:r>
         <w:t xml:space="preserve"> 0009-0001-5304-2170</w:t>
-      </w:r>
-    </w:p>
-    <w:p>
-      <w:pPr>
-        <w:pStyle w:val="Default"/>
-        <w:jc w:val="both"/>
-        <w:rPr>
-          <w:color w:val="auto"/>
-          <w:sz w:val="20"/>
-          <w:szCs w:val="20"/>
-        </w:rPr>
-      </w:pPr>
-      <w:r>
-        <w:rPr>
-          <w:color w:val="auto"/>
-          <w:sz w:val="20"/>
-          <w:szCs w:val="20"/>
-        </w:rPr>
-        <w:t>Web of Science Researcher ID:</w:t>
-      </w:r>
-      <w:r>
-        <w:rPr>
-          <w:highlight w:val="yellow"/>
-        </w:rPr>
-        <w:t xml:space="preserve"> [ADD IF AVAILABLE]</w:t>
-      </w:r>
-    </w:p>
-    <w:p>
-      <w:pPr>
-        <w:pStyle w:val="Default"/>
-        <w:jc w:val="both"/>
-        <w:rPr>
-          <w:color w:val="auto"/>
-          <w:sz w:val="20"/>
-          <w:szCs w:val="20"/>
-        </w:rPr>
-      </w:pPr>
-      <w:r>
-        <w:rPr>
-          <w:color w:val="auto"/>
-          <w:sz w:val="20"/>
-          <w:szCs w:val="20"/>
-        </w:rPr>
-        <w:t>Submission date:</w:t>
-      </w:r>
-      <w:r>
-        <w:rPr>
-          <w:highlight w:val="yellow"/>
-        </w:rPr>
-        <w:t xml:space="preserve"> [DATE]</w:t>
       </w:r>
     </w:p>
     <w:p>
@@ -4449,255 +4143,6 @@
     </w:p>
     <w:p>
       <w:pPr>
-        <w:snapToGrid w:val="0"/>
-        <w:spacing w:after="0" w:line="240" w:lineRule="auto"/>
-        <w:rPr>
-          <w:rFonts w:ascii="Times New Roman" w:hAnsi="Times New Roman" w:cs="Times New Roman"/>
-          <w:lang w:val="en-US"/>
-        </w:rPr>
-      </w:pPr>
-    </w:p>
-    <w:tbl>
-      <w:tblPr>
-        <w:tblStyle w:val="a9"/>
-        <w:tblW w:w="0" w:type="auto"/>
-        <w:tblLook w:val="04A0" w:firstRow="1" w:lastRow="0" w:firstColumn="1" w:lastColumn="0" w:noHBand="0" w:noVBand="1"/>
-      </w:tblPr>
-      <w:tblGrid>
-        <w:gridCol w:w="3115"/>
-        <w:gridCol w:w="3115"/>
-        <w:gridCol w:w="3115"/>
-      </w:tblGrid>
-      <w:tr>
-        <w:tc>
-          <w:tcPr>
-            <w:tcW w:w="3115" w:type="dxa"/>
-          </w:tcPr>
-          <w:p>
-            <w:pPr>
-              <w:pStyle w:val="a3"/>
-              <w:jc w:val="left"/>
-              <w:rPr>
-                <w:rFonts w:ascii="Times New Roman" w:eastAsiaTheme="minorEastAsia" w:hAnsi="Times New Roman"/>
-                <w:b/>
-                <w:bCs/>
-                <w:sz w:val="16"/>
-                <w:szCs w:val="16"/>
-                <w:lang w:val="en-US" w:eastAsia="ko-KR"/>
-              </w:rPr>
-            </w:pPr>
-            <w:r>
-              <w:rPr>
-                <w:rFonts w:ascii="Times New Roman" w:eastAsiaTheme="minorEastAsia" w:hAnsi="Times New Roman"/>
-                <w:b/>
-                <w:bCs/>
-                <w:sz w:val="16"/>
-                <w:szCs w:val="16"/>
-                <w:lang w:val="en-US" w:eastAsia="ko-KR"/>
-              </w:rPr>
-              <w:t>Author</w:t>
-            </w:r>
-          </w:p>
-        </w:tc>
-        <w:tc>
-          <w:tcPr>
-            <w:tcW w:w="3115" w:type="dxa"/>
-          </w:tcPr>
-          <w:p>
-            <w:pPr>
-              <w:pStyle w:val="a3"/>
-              <w:jc w:val="left"/>
-              <w:rPr>
-                <w:rFonts w:ascii="Times New Roman" w:eastAsiaTheme="minorEastAsia" w:hAnsi="Times New Roman"/>
-                <w:b/>
-                <w:bCs/>
-                <w:sz w:val="16"/>
-                <w:szCs w:val="16"/>
-                <w:lang w:val="en-US" w:eastAsia="ko-KR"/>
-              </w:rPr>
-            </w:pPr>
-            <w:r>
-              <w:rPr>
-                <w:rFonts w:ascii="Times New Roman" w:eastAsiaTheme="minorEastAsia" w:hAnsi="Times New Roman"/>
-                <w:b/>
-                <w:bCs/>
-                <w:sz w:val="16"/>
-                <w:szCs w:val="16"/>
-                <w:lang w:val="en-US" w:eastAsia="ko-KR"/>
-              </w:rPr>
-              <w:t>Signature</w:t>
-            </w:r>
-          </w:p>
-        </w:tc>
-        <w:tc>
-          <w:tcPr>
-            <w:tcW w:w="3115" w:type="dxa"/>
-          </w:tcPr>
-          <w:p>
-            <w:pPr>
-              <w:pStyle w:val="a3"/>
-              <w:jc w:val="left"/>
-              <w:rPr>
-                <w:rFonts w:ascii="Times New Roman" w:eastAsiaTheme="minorEastAsia" w:hAnsi="Times New Roman"/>
-                <w:b/>
-                <w:bCs/>
-                <w:sz w:val="16"/>
-                <w:szCs w:val="16"/>
-                <w:lang w:val="en-US" w:eastAsia="ko-KR"/>
-              </w:rPr>
-            </w:pPr>
-            <w:r>
-              <w:rPr>
-                <w:rFonts w:ascii="Times New Roman" w:eastAsiaTheme="minorEastAsia" w:hAnsi="Times New Roman"/>
-                <w:b/>
-                <w:bCs/>
-                <w:sz w:val="16"/>
-                <w:szCs w:val="16"/>
-                <w:lang w:val="en-US" w:eastAsia="ko-KR"/>
-              </w:rPr>
-              <w:t>Date</w:t>
-            </w:r>
-          </w:p>
-        </w:tc>
-      </w:tr>
-      <w:tr>
-        <w:tc>
-          <w:tcPr>
-            <w:tcW w:w="3115" w:type="dxa"/>
-          </w:tcPr>
-          <w:p>
-            <w:r>
-              <w:t>Phillip Wikes</w:t>
-            </w:r>
-          </w:p>
-        </w:tc>
-        <w:tc>
-          <w:tcPr>
-            <w:tcW w:w="3115" w:type="dxa"/>
-          </w:tcPr>
-          <w:p>
-            <w:pPr>
-              <w:pStyle w:val="a3"/>
-              <w:rPr>
-                <w:rFonts w:ascii="Times New Roman" w:eastAsiaTheme="minorEastAsia" w:hAnsi="Times New Roman"/>
-                <w:sz w:val="16"/>
-                <w:szCs w:val="16"/>
-                <w:lang w:val="en-US" w:eastAsia="ko-KR"/>
-              </w:rPr>
-            </w:pPr>
-          </w:p>
-        </w:tc>
-        <w:tc>
-          <w:tcPr>
-            <w:tcW w:w="3115" w:type="dxa"/>
-          </w:tcPr>
-          <w:p>
-            <w:pPr>
-              <w:pStyle w:val="a3"/>
-              <w:rPr>
-                <w:rFonts w:ascii="Times New Roman" w:eastAsiaTheme="minorEastAsia" w:hAnsi="Times New Roman"/>
-                <w:sz w:val="16"/>
-                <w:szCs w:val="16"/>
-                <w:lang w:val="en-US" w:eastAsia="ko-KR"/>
-              </w:rPr>
-            </w:pPr>
-          </w:p>
-        </w:tc>
-      </w:tr>
-      <w:tr>
-        <w:tc>
-          <w:tcPr>
-            <w:tcW w:w="3115" w:type="dxa"/>
-          </w:tcPr>
-          <w:p>
-            <w:r>
-              <w:t>Ubayet Hossain, FRM</w:t>
-            </w:r>
-          </w:p>
-        </w:tc>
-        <w:tc>
-          <w:tcPr>
-            <w:tcW w:w="3115" w:type="dxa"/>
-          </w:tcPr>
-          <w:p>
-            <w:pPr>
-              <w:pStyle w:val="a3"/>
-              <w:rPr>
-                <w:rFonts w:ascii="Times New Roman" w:eastAsiaTheme="minorEastAsia" w:hAnsi="Times New Roman"/>
-                <w:sz w:val="16"/>
-                <w:szCs w:val="16"/>
-                <w:lang w:val="en-US" w:eastAsia="ko-KR"/>
-              </w:rPr>
-            </w:pPr>
-          </w:p>
-        </w:tc>
-        <w:tc>
-          <w:tcPr>
-            <w:tcW w:w="3115" w:type="dxa"/>
-          </w:tcPr>
-          <w:p>
-            <w:pPr>
-              <w:pStyle w:val="a3"/>
-              <w:rPr>
-                <w:rFonts w:ascii="Times New Roman" w:eastAsiaTheme="minorEastAsia" w:hAnsi="Times New Roman"/>
-                <w:sz w:val="16"/>
-                <w:szCs w:val="16"/>
-                <w:lang w:val="en-US" w:eastAsia="ko-KR"/>
-              </w:rPr>
-            </w:pPr>
-          </w:p>
-        </w:tc>
-      </w:tr>
-    </w:tbl>
-    <w:p>
-      <w:pPr>
-        <w:pStyle w:val="a3"/>
-        <w:rPr>
-          <w:rFonts w:ascii="Times New Roman" w:eastAsiaTheme="minorEastAsia" w:hAnsi="Times New Roman" w:cs="Times New Roman"/>
-          <w:sz w:val="22"/>
-          <w:szCs w:val="22"/>
-          <w:lang w:val="uk-UA" w:eastAsia="ko-KR"/>
-        </w:rPr>
-      </w:pPr>
-      <w:r>
-        <w:rPr>
-          <w:rFonts w:ascii="Times New Roman" w:eastAsiaTheme="minorEastAsia" w:hAnsi="Times New Roman" w:cs="Times New Roman"/>
-          <w:sz w:val="18"/>
-          <w:szCs w:val="18"/>
-          <w:lang w:val="en-US" w:eastAsia="ko-KR"/>
-        </w:rPr>
-        <w:t>*Fill in this form, print, sign (handwritten signatures), scan</w:t>
-      </w:r>
-      <w:r>
-        <w:rPr>
-          <w:rFonts w:ascii="Times New Roman" w:eastAsiaTheme="minorEastAsia" w:hAnsi="Times New Roman" w:cs="Times New Roman"/>
-          <w:sz w:val="18"/>
-          <w:szCs w:val="18"/>
-          <w:lang w:val="uk-UA" w:eastAsia="ko-KR"/>
-        </w:rPr>
-        <w:t>,</w:t>
-      </w:r>
-      <w:r>
-        <w:rPr>
-          <w:rFonts w:ascii="Times New Roman" w:eastAsiaTheme="minorEastAsia" w:hAnsi="Times New Roman" w:cs="Times New Roman"/>
-          <w:sz w:val="18"/>
-          <w:szCs w:val="18"/>
-          <w:lang w:val="en-US" w:eastAsia="ko-KR"/>
-        </w:rPr>
-        <w:t xml:space="preserve"> and send us by e-mail</w:t>
-      </w:r>
-      <w:r>
-        <w:rPr>
-          <w:rFonts w:ascii="Times New Roman" w:eastAsiaTheme="minorEastAsia" w:hAnsi="Times New Roman" w:cs="Times New Roman"/>
-          <w:sz w:val="18"/>
-          <w:szCs w:val="18"/>
-          <w:lang w:val="uk-UA" w:eastAsia="ko-KR"/>
-        </w:rPr>
-        <w:t>.</w:t>
-      </w:r>
-    </w:p>
-    <w:p>
-      <w:pPr>
         <w:pStyle w:val="a3"/>
         <w:rPr>
           <w:rFonts w:ascii="Times New Roman" w:eastAsia="MyriadLightCondensed" w:hAnsi="Times New Roman" w:cs="Times New Roman"/>
@@ -4707,10 +4152,7 @@
           <w:lang w:val="en-US"/>
         </w:rPr>
       </w:pPr>
-    </w:p>
-    <w:p>
-      <w:pPr>
-        <w:pStyle w:val="a3"/>
+      <w:r>
         <w:rPr>
           <w:rFonts w:ascii="Times New Roman" w:eastAsia="MyriadLightCondensed" w:hAnsi="Times New Roman" w:cs="Times New Roman"/>
           <w:color w:val="000000"/>
@@ -4718,199 +4160,8 @@
           <w:szCs w:val="18"/>
           <w:lang w:val="en-US"/>
         </w:rPr>
-      </w:pPr>
-      <w:r>
-        <w:rPr>
-          <w:rFonts w:ascii="Times New Roman" w:eastAsia="MyriadLightCondensed" w:hAnsi="Times New Roman" w:cs="Times New Roman"/>
-          <w:color w:val="000000"/>
-          <w:sz w:val="18"/>
-          <w:szCs w:val="18"/>
-          <w:lang w:val="en-US"/>
-        </w:rPr>
         <w:t>The corresponding author also warrants to inform all other co-authors about editorial decisions, results of peer-review, all changes or revisions needed both prior and after publication (in case the article needs correction or retraction).</w:t>
       </w:r>
-    </w:p>
-    <w:p>
-      <w:pPr>
-        <w:pStyle w:val="a3"/>
-        <w:rPr>
-          <w:rFonts w:ascii="Times New Roman" w:eastAsia="MyriadLightCondensed" w:hAnsi="Times New Roman" w:cs="Times New Roman"/>
-          <w:color w:val="000000"/>
-          <w:sz w:val="18"/>
-          <w:szCs w:val="18"/>
-          <w:lang w:val="en-US"/>
-        </w:rPr>
-      </w:pPr>
-    </w:p>
-    <w:tbl>
-      <w:tblPr>
-        <w:tblStyle w:val="a9"/>
-        <w:tblW w:w="0" w:type="auto"/>
-        <w:tblLook w:val="04A0" w:firstRow="1" w:lastRow="0" w:firstColumn="1" w:lastColumn="0" w:noHBand="0" w:noVBand="1"/>
-      </w:tblPr>
-      <w:tblGrid>
-        <w:gridCol w:w="3115"/>
-        <w:gridCol w:w="3115"/>
-        <w:gridCol w:w="3115"/>
-      </w:tblGrid>
-      <w:tr>
-        <w:tc>
-          <w:tcPr>
-            <w:tcW w:w="3115" w:type="dxa"/>
-          </w:tcPr>
-          <w:p>
-            <w:pPr>
-              <w:pStyle w:val="a3"/>
-              <w:jc w:val="left"/>
-              <w:rPr>
-                <w:rFonts w:ascii="Times New Roman" w:eastAsiaTheme="minorEastAsia" w:hAnsi="Times New Roman"/>
-                <w:b/>
-                <w:bCs/>
-                <w:sz w:val="16"/>
-                <w:szCs w:val="16"/>
-                <w:lang w:val="en-US" w:eastAsia="ko-KR"/>
-              </w:rPr>
-            </w:pPr>
-            <w:r>
-              <w:rPr>
-                <w:rFonts w:ascii="Times New Roman" w:eastAsiaTheme="minorEastAsia" w:hAnsi="Times New Roman"/>
-                <w:b/>
-                <w:bCs/>
-                <w:sz w:val="16"/>
-                <w:szCs w:val="16"/>
-                <w:lang w:val="en-US" w:eastAsia="ko-KR"/>
-              </w:rPr>
-              <w:t>Corresponding a</w:t>
-            </w:r>
-            <w:r>
-              <w:rPr>
-                <w:rFonts w:ascii="Times New Roman" w:eastAsiaTheme="minorEastAsia" w:hAnsi="Times New Roman"/>
-                <w:b/>
-                <w:bCs/>
-                <w:sz w:val="16"/>
-                <w:szCs w:val="16"/>
-                <w:lang w:val="en-US" w:eastAsia="ko-KR"/>
-              </w:rPr>
-              <w:t>uthor</w:t>
-            </w:r>
-          </w:p>
-        </w:tc>
-        <w:tc>
-          <w:tcPr>
-            <w:tcW w:w="3115" w:type="dxa"/>
-          </w:tcPr>
-          <w:p>
-            <w:pPr>
-              <w:pStyle w:val="a3"/>
-              <w:jc w:val="left"/>
-              <w:rPr>
-                <w:rFonts w:ascii="Times New Roman" w:eastAsiaTheme="minorEastAsia" w:hAnsi="Times New Roman"/>
-                <w:b/>
-                <w:bCs/>
-                <w:sz w:val="16"/>
-                <w:szCs w:val="16"/>
-                <w:lang w:val="en-US" w:eastAsia="ko-KR"/>
-              </w:rPr>
-            </w:pPr>
-            <w:r>
-              <w:rPr>
-                <w:rFonts w:ascii="Times New Roman" w:eastAsiaTheme="minorEastAsia" w:hAnsi="Times New Roman"/>
-                <w:b/>
-                <w:bCs/>
-                <w:sz w:val="16"/>
-                <w:szCs w:val="16"/>
-                <w:lang w:val="en-US" w:eastAsia="ko-KR"/>
-              </w:rPr>
-              <w:t>Signature</w:t>
-            </w:r>
-          </w:p>
-        </w:tc>
-        <w:tc>
-          <w:tcPr>
-            <w:tcW w:w="3115" w:type="dxa"/>
-          </w:tcPr>
-          <w:p>
-            <w:pPr>
-              <w:pStyle w:val="a3"/>
-              <w:jc w:val="left"/>
-              <w:rPr>
-                <w:rFonts w:ascii="Times New Roman" w:eastAsiaTheme="minorEastAsia" w:hAnsi="Times New Roman"/>
-                <w:b/>
-                <w:bCs/>
-                <w:sz w:val="16"/>
-                <w:szCs w:val="16"/>
-                <w:lang w:val="en-US" w:eastAsia="ko-KR"/>
-              </w:rPr>
-            </w:pPr>
-            <w:r>
-              <w:rPr>
-                <w:rFonts w:ascii="Times New Roman" w:eastAsiaTheme="minorEastAsia" w:hAnsi="Times New Roman"/>
-                <w:b/>
-                <w:bCs/>
-                <w:sz w:val="16"/>
-                <w:szCs w:val="16"/>
-                <w:lang w:val="en-US" w:eastAsia="ko-KR"/>
-              </w:rPr>
-              <w:t>Date</w:t>
-            </w:r>
-          </w:p>
-        </w:tc>
-      </w:tr>
-      <w:tr>
-        <w:tc>
-          <w:tcPr>
-            <w:tcW w:w="3115" w:type="dxa"/>
-          </w:tcPr>
-          <w:p>
-            <w:r>
-              <w:t>Phillip Wikes</w:t>
-            </w:r>
-          </w:p>
-        </w:tc>
-        <w:tc>
-          <w:tcPr>
-            <w:tcW w:w="3115" w:type="dxa"/>
-          </w:tcPr>
-          <w:p>
-            <w:pPr>
-              <w:pStyle w:val="a3"/>
-              <w:rPr>
-                <w:rFonts w:ascii="Times New Roman" w:eastAsiaTheme="minorEastAsia" w:hAnsi="Times New Roman"/>
-                <w:sz w:val="16"/>
-                <w:szCs w:val="16"/>
-                <w:lang w:val="en-US" w:eastAsia="ko-KR"/>
-              </w:rPr>
-            </w:pPr>
-          </w:p>
-        </w:tc>
-        <w:tc>
-          <w:tcPr>
-            <w:tcW w:w="3115" w:type="dxa"/>
-          </w:tcPr>
-          <w:p>
-            <w:pPr>
-              <w:pStyle w:val="a3"/>
-              <w:rPr>
-                <w:rFonts w:ascii="Times New Roman" w:eastAsiaTheme="minorEastAsia" w:hAnsi="Times New Roman"/>
-                <w:sz w:val="16"/>
-                <w:szCs w:val="16"/>
-                <w:lang w:val="en-US" w:eastAsia="ko-KR"/>
-              </w:rPr>
-            </w:pPr>
-          </w:p>
-        </w:tc>
-      </w:tr>
-    </w:tbl>
-    <w:p>
-      <w:pPr>
-        <w:pStyle w:val="a3"/>
-        <w:rPr>
-          <w:rFonts w:ascii="Times New Roman" w:eastAsiaTheme="minorEastAsia" w:hAnsi="Times New Roman" w:cs="Times New Roman"/>
-          <w:sz w:val="18"/>
-          <w:szCs w:val="18"/>
-          <w:lang w:val="en-US" w:eastAsia="ko-KR"/>
-        </w:rPr>
-      </w:pPr>
     </w:p>
     <w:sectPr>
       <w:headerReference w:type="default" r:id="rId14"/>

</xml_diff>